<commit_message>
completed react component hierarchy charts
</commit_message>
<xml_diff>
--- a/Design/(2) frameworks.docx
+++ b/Design/(2) frameworks.docx
@@ -35,7 +35,25 @@
           <w:sz w:val="24"/>
           <w:szCs w:val="24"/>
         </w:rPr>
-        <w:t>2.1 React</w:t>
+        <w:t xml:space="preserve">2.1 </w:t>
+      </w:r>
+      <w:r>
+        <w:rPr>
+          <w:b/>
+          <w:bCs/>
+          <w:sz w:val="24"/>
+          <w:szCs w:val="24"/>
+        </w:rPr>
+        <w:t xml:space="preserve">Frontend - </w:t>
+      </w:r>
+      <w:r>
+        <w:rPr>
+          <w:b/>
+          <w:bCs/>
+          <w:sz w:val="24"/>
+          <w:szCs w:val="24"/>
+        </w:rPr>
+        <w:t>React</w:t>
       </w:r>
     </w:p>
     <w:p>
@@ -281,6 +299,342 @@
     <w:p>
       <w:r>
         <w:t>An additional advantage with React is its popularity, since it means it is well-documented, and easy to find solutions to different problems during implementation as well as after, helping keep the website reliable throughout.</w:t>
+      </w:r>
+    </w:p>
+    <w:p>
+      <w:pPr>
+        <w:rPr>
+          <w:b/>
+          <w:bCs/>
+        </w:rPr>
+      </w:pPr>
+      <w:r>
+        <w:rPr>
+          <w:b/>
+          <w:bCs/>
+        </w:rPr>
+        <w:t>Component Hierarchy Charts:</w:t>
+      </w:r>
+    </w:p>
+    <w:p>
+      <w:r>
+        <w:t>The heading of each component is its name, while the list below it includes state and other possible fields, as well as their expected data types. The fields of the objects will be covered in future design sections.</w:t>
+      </w:r>
+    </w:p>
+    <w:p>
+      <w:r>
+        <w:rPr>
+          <w:noProof/>
+        </w:rPr>
+        <w:drawing>
+          <wp:inline distT="0" distB="0" distL="0" distR="0" wp14:anchorId="1FAB19C1" wp14:editId="05C90FA7">
+            <wp:extent cx="5381625" cy="2676525"/>
+            <wp:effectExtent l="0" t="0" r="9525" b="9525"/>
+            <wp:docPr id="1271554883" name="Picture 2" descr="A screenshot of a computer&#10;&#10;AI-generated content may be incorrect."/>
+            <wp:cNvGraphicFramePr>
+              <a:graphicFrameLocks xmlns:a="http://schemas.openxmlformats.org/drawingml/2006/main" noChangeAspect="1"/>
+            </wp:cNvGraphicFramePr>
+            <a:graphic xmlns:a="http://schemas.openxmlformats.org/drawingml/2006/main">
+              <a:graphicData uri="http://schemas.openxmlformats.org/drawingml/2006/picture">
+                <pic:pic xmlns:pic="http://schemas.openxmlformats.org/drawingml/2006/picture">
+                  <pic:nvPicPr>
+                    <pic:cNvPr id="1271554883" name="Picture 2" descr="A screenshot of a computer&#10;&#10;AI-generated content may be incorrect."/>
+                    <pic:cNvPicPr>
+                      <a:picLocks noChangeAspect="1" noChangeArrowheads="1"/>
+                    </pic:cNvPicPr>
+                  </pic:nvPicPr>
+                  <pic:blipFill>
+                    <a:blip r:embed="rId5">
+                      <a:extLst>
+                        <a:ext uri="{28A0092B-C50C-407E-A947-70E740481C1C}">
+                          <a14:useLocalDpi xmlns:a14="http://schemas.microsoft.com/office/drawing/2010/main" val="0"/>
+                        </a:ext>
+                      </a:extLst>
+                    </a:blip>
+                    <a:srcRect/>
+                    <a:stretch>
+                      <a:fillRect/>
+                    </a:stretch>
+                  </pic:blipFill>
+                  <pic:spPr bwMode="auto">
+                    <a:xfrm>
+                      <a:off x="0" y="0"/>
+                      <a:ext cx="5381625" cy="2676525"/>
+                    </a:xfrm>
+                    <a:prstGeom prst="rect">
+                      <a:avLst/>
+                    </a:prstGeom>
+                    <a:noFill/>
+                    <a:ln>
+                      <a:noFill/>
+                    </a:ln>
+                  </pic:spPr>
+                </pic:pic>
+              </a:graphicData>
+            </a:graphic>
+          </wp:inline>
+        </w:drawing>
+      </w:r>
+    </w:p>
+    <w:p>
+      <w:r>
+        <w:rPr>
+          <w:noProof/>
+        </w:rPr>
+        <w:lastRenderedPageBreak/>
+        <w:drawing>
+          <wp:inline distT="0" distB="0" distL="0" distR="0" wp14:anchorId="0E9CE807" wp14:editId="22728959">
+            <wp:extent cx="5731510" cy="2339340"/>
+            <wp:effectExtent l="0" t="0" r="2540" b="3810"/>
+            <wp:docPr id="469088537" name="Picture 11" descr="A screenshot of a computer&#10;&#10;AI-generated content may be incorrect."/>
+            <wp:cNvGraphicFramePr>
+              <a:graphicFrameLocks xmlns:a="http://schemas.openxmlformats.org/drawingml/2006/main" noChangeAspect="1"/>
+            </wp:cNvGraphicFramePr>
+            <a:graphic xmlns:a="http://schemas.openxmlformats.org/drawingml/2006/main">
+              <a:graphicData uri="http://schemas.openxmlformats.org/drawingml/2006/picture">
+                <pic:pic xmlns:pic="http://schemas.openxmlformats.org/drawingml/2006/picture">
+                  <pic:nvPicPr>
+                    <pic:cNvPr id="469088537" name="Picture 11" descr="A screenshot of a computer&#10;&#10;AI-generated content may be incorrect."/>
+                    <pic:cNvPicPr>
+                      <a:picLocks noChangeAspect="1" noChangeArrowheads="1"/>
+                    </pic:cNvPicPr>
+                  </pic:nvPicPr>
+                  <pic:blipFill>
+                    <a:blip r:embed="rId6">
+                      <a:extLst>
+                        <a:ext uri="{28A0092B-C50C-407E-A947-70E740481C1C}">
+                          <a14:useLocalDpi xmlns:a14="http://schemas.microsoft.com/office/drawing/2010/main" val="0"/>
+                        </a:ext>
+                      </a:extLst>
+                    </a:blip>
+                    <a:srcRect/>
+                    <a:stretch>
+                      <a:fillRect/>
+                    </a:stretch>
+                  </pic:blipFill>
+                  <pic:spPr bwMode="auto">
+                    <a:xfrm>
+                      <a:off x="0" y="0"/>
+                      <a:ext cx="5731510" cy="2339340"/>
+                    </a:xfrm>
+                    <a:prstGeom prst="rect">
+                      <a:avLst/>
+                    </a:prstGeom>
+                    <a:noFill/>
+                    <a:ln>
+                      <a:noFill/>
+                    </a:ln>
+                  </pic:spPr>
+                </pic:pic>
+              </a:graphicData>
+            </a:graphic>
+          </wp:inline>
+        </w:drawing>
+      </w:r>
+    </w:p>
+    <w:p>
+      <w:r>
+        <w:rPr>
+          <w:noProof/>
+        </w:rPr>
+        <w:drawing>
+          <wp:inline distT="0" distB="0" distL="0" distR="0" wp14:anchorId="53E6D21C" wp14:editId="4834EB68">
+            <wp:extent cx="5731510" cy="2908935"/>
+            <wp:effectExtent l="0" t="0" r="2540" b="5715"/>
+            <wp:docPr id="1694303220" name="Picture 5" descr="A screenshot of a computer&#10;&#10;AI-generated content may be incorrect."/>
+            <wp:cNvGraphicFramePr>
+              <a:graphicFrameLocks xmlns:a="http://schemas.openxmlformats.org/drawingml/2006/main" noChangeAspect="1"/>
+            </wp:cNvGraphicFramePr>
+            <a:graphic xmlns:a="http://schemas.openxmlformats.org/drawingml/2006/main">
+              <a:graphicData uri="http://schemas.openxmlformats.org/drawingml/2006/picture">
+                <pic:pic xmlns:pic="http://schemas.openxmlformats.org/drawingml/2006/picture">
+                  <pic:nvPicPr>
+                    <pic:cNvPr id="1694303220" name="Picture 5" descr="A screenshot of a computer&#10;&#10;AI-generated content may be incorrect."/>
+                    <pic:cNvPicPr>
+                      <a:picLocks noChangeAspect="1" noChangeArrowheads="1"/>
+                    </pic:cNvPicPr>
+                  </pic:nvPicPr>
+                  <pic:blipFill>
+                    <a:blip r:embed="rId7">
+                      <a:extLst>
+                        <a:ext uri="{28A0092B-C50C-407E-A947-70E740481C1C}">
+                          <a14:useLocalDpi xmlns:a14="http://schemas.microsoft.com/office/drawing/2010/main" val="0"/>
+                        </a:ext>
+                      </a:extLst>
+                    </a:blip>
+                    <a:srcRect/>
+                    <a:stretch>
+                      <a:fillRect/>
+                    </a:stretch>
+                  </pic:blipFill>
+                  <pic:spPr bwMode="auto">
+                    <a:xfrm>
+                      <a:off x="0" y="0"/>
+                      <a:ext cx="5731510" cy="2908935"/>
+                    </a:xfrm>
+                    <a:prstGeom prst="rect">
+                      <a:avLst/>
+                    </a:prstGeom>
+                    <a:noFill/>
+                    <a:ln>
+                      <a:noFill/>
+                    </a:ln>
+                  </pic:spPr>
+                </pic:pic>
+              </a:graphicData>
+            </a:graphic>
+          </wp:inline>
+        </w:drawing>
+      </w:r>
+    </w:p>
+    <w:p>
+      <w:r>
+        <w:t>Note that number of charts, what type of charts, category names are not yet specified, this is a general structure.</w:t>
+      </w:r>
+    </w:p>
+    <w:p>
+      <w:r>
+        <w:rPr>
+          <w:noProof/>
+        </w:rPr>
+        <w:drawing>
+          <wp:inline distT="0" distB="0" distL="0" distR="0" wp14:anchorId="70248BEA" wp14:editId="2CA1CD72">
+            <wp:extent cx="5731510" cy="1701165"/>
+            <wp:effectExtent l="0" t="0" r="2540" b="0"/>
+            <wp:docPr id="1804098081" name="Picture 7" descr="A screenshot of a computer program&#10;&#10;AI-generated content may be incorrect."/>
+            <wp:cNvGraphicFramePr>
+              <a:graphicFrameLocks xmlns:a="http://schemas.openxmlformats.org/drawingml/2006/main" noChangeAspect="1"/>
+            </wp:cNvGraphicFramePr>
+            <a:graphic xmlns:a="http://schemas.openxmlformats.org/drawingml/2006/main">
+              <a:graphicData uri="http://schemas.openxmlformats.org/drawingml/2006/picture">
+                <pic:pic xmlns:pic="http://schemas.openxmlformats.org/drawingml/2006/picture">
+                  <pic:nvPicPr>
+                    <pic:cNvPr id="1804098081" name="Picture 7" descr="A screenshot of a computer program&#10;&#10;AI-generated content may be incorrect."/>
+                    <pic:cNvPicPr>
+                      <a:picLocks noChangeAspect="1" noChangeArrowheads="1"/>
+                    </pic:cNvPicPr>
+                  </pic:nvPicPr>
+                  <pic:blipFill>
+                    <a:blip r:embed="rId8">
+                      <a:extLst>
+                        <a:ext uri="{28A0092B-C50C-407E-A947-70E740481C1C}">
+                          <a14:useLocalDpi xmlns:a14="http://schemas.microsoft.com/office/drawing/2010/main" val="0"/>
+                        </a:ext>
+                      </a:extLst>
+                    </a:blip>
+                    <a:srcRect/>
+                    <a:stretch>
+                      <a:fillRect/>
+                    </a:stretch>
+                  </pic:blipFill>
+                  <pic:spPr bwMode="auto">
+                    <a:xfrm>
+                      <a:off x="0" y="0"/>
+                      <a:ext cx="5731510" cy="1701165"/>
+                    </a:xfrm>
+                    <a:prstGeom prst="rect">
+                      <a:avLst/>
+                    </a:prstGeom>
+                    <a:noFill/>
+                    <a:ln>
+                      <a:noFill/>
+                    </a:ln>
+                  </pic:spPr>
+                </pic:pic>
+              </a:graphicData>
+            </a:graphic>
+          </wp:inline>
+        </w:drawing>
+      </w:r>
+    </w:p>
+    <w:p>
+      <w:r>
+        <w:t>Note that since the data needed will be provided via props from PlaystyleClassification, there is no need to specify additional state for each child.</w:t>
+      </w:r>
+    </w:p>
+    <w:p>
+      <w:r>
+        <w:rPr>
+          <w:noProof/>
+        </w:rPr>
+        <w:lastRenderedPageBreak/>
+        <w:drawing>
+          <wp:inline distT="0" distB="0" distL="0" distR="0" wp14:anchorId="7590B114" wp14:editId="1FCC4641">
+            <wp:extent cx="5191125" cy="2009775"/>
+            <wp:effectExtent l="0" t="0" r="9525" b="9525"/>
+            <wp:docPr id="658858048" name="Picture 12" descr="A screenshot of a computer&#10;&#10;AI-generated content may be incorrect."/>
+            <wp:cNvGraphicFramePr>
+              <a:graphicFrameLocks xmlns:a="http://schemas.openxmlformats.org/drawingml/2006/main" noChangeAspect="1"/>
+            </wp:cNvGraphicFramePr>
+            <a:graphic xmlns:a="http://schemas.openxmlformats.org/drawingml/2006/main">
+              <a:graphicData uri="http://schemas.openxmlformats.org/drawingml/2006/picture">
+                <pic:pic xmlns:pic="http://schemas.openxmlformats.org/drawingml/2006/picture">
+                  <pic:nvPicPr>
+                    <pic:cNvPr id="658858048" name="Picture 12" descr="A screenshot of a computer&#10;&#10;AI-generated content may be incorrect."/>
+                    <pic:cNvPicPr>
+                      <a:picLocks noChangeAspect="1" noChangeArrowheads="1"/>
+                    </pic:cNvPicPr>
+                  </pic:nvPicPr>
+                  <pic:blipFill>
+                    <a:blip r:embed="rId9">
+                      <a:extLst>
+                        <a:ext uri="{28A0092B-C50C-407E-A947-70E740481C1C}">
+                          <a14:useLocalDpi xmlns:a14="http://schemas.microsoft.com/office/drawing/2010/main" val="0"/>
+                        </a:ext>
+                      </a:extLst>
+                    </a:blip>
+                    <a:srcRect/>
+                    <a:stretch>
+                      <a:fillRect/>
+                    </a:stretch>
+                  </pic:blipFill>
+                  <pic:spPr bwMode="auto">
+                    <a:xfrm>
+                      <a:off x="0" y="0"/>
+                      <a:ext cx="5191125" cy="2009775"/>
+                    </a:xfrm>
+                    <a:prstGeom prst="rect">
+                      <a:avLst/>
+                    </a:prstGeom>
+                    <a:noFill/>
+                    <a:ln>
+                      <a:noFill/>
+                    </a:ln>
+                  </pic:spPr>
+                </pic:pic>
+              </a:graphicData>
+            </a:graphic>
+          </wp:inline>
+        </w:drawing>
+      </w:r>
+    </w:p>
+    <w:p>
+      <w:pPr>
+        <w:rPr>
+          <w:b/>
+          <w:bCs/>
+          <w:sz w:val="24"/>
+          <w:szCs w:val="24"/>
+        </w:rPr>
+      </w:pPr>
+    </w:p>
+    <w:p>
+      <w:pPr>
+        <w:rPr>
+          <w:b/>
+          <w:bCs/>
+          <w:sz w:val="24"/>
+          <w:szCs w:val="24"/>
+        </w:rPr>
+      </w:pPr>
+      <w:r>
+        <w:rPr>
+          <w:b/>
+          <w:bCs/>
+          <w:sz w:val="24"/>
+          <w:szCs w:val="24"/>
+        </w:rPr>
+        <w:t>2.2 Backend - FastAPI</w:t>
       </w:r>
     </w:p>
     <w:sectPr>

</xml_diff>